<commit_message>
Remove the summary-of-evidence paragraph from the response letter cover page
The cover letter opened with a paragraph summarising the two additions -- measuring error
correlation directly, and the pre-registered clinical replication -- before the point-by-point
responses. Removed at the author's request. The cover letter now goes from the list of uploaded
files straight to the signature, and every substantive claim it made is still made where it
belongs, in the Author responses to R3.3 and R1.3 / R3.6.

The binding rule that gated the "537" in that paragraph is removed with it; leaving it would have
failed the gate as an unused rule, which is how the gate reports a sentence that no longer exists.

Response letter is now 11 pages. 14 gates pass, including highlight coverage at 3,704 changed
words with 0 unhighlighted, and the highlighted PDF still matches the manuscript line for line
across all 1,575 text lines.
</commit_message>
<xml_diff>
--- a/submission/IEEE-Access-Response-to-Reviewers.docx
+++ b/submission/IEEE-Access-Response-to-Reviewers.docx
@@ -114,56 +114,6 @@
       </w:r>
       <w:r>
         <w:t xml:space="preserve">).</w:t>
-      </w:r>
-    </w:p>
-    <w:p>
-      <w:pPr>
-        <w:pStyle w:val="BodyText"/>
-      </w:pPr>
-      <w:r>
-        <w:t xml:space="preserve">The revision adds two substantial pieces of evidence. First, we now measure the correlation</w:t>
-      </w:r>
-      <w:r>
-        <w:t xml:space="preserve"> </w:t>
-      </w:r>
-      <w:r>
-        <w:t xml:space="preserve">between agents’ errors directly rather than inferring it from label agreement, which is what the</w:t>
-      </w:r>
-      <w:r>
-        <w:t xml:space="preserve"> </w:t>
-      </w:r>
-      <w:r>
-        <w:t xml:space="preserve">term</w:t>
-      </w:r>
-      <w:r>
-        <w:t xml:space="preserve"> </w:t>
-      </w:r>
-      <w:r>
-        <w:t xml:space="preserve">“de-correlation”</w:t>
-      </w:r>
-      <w:r>
-        <w:t xml:space="preserve"> </w:t>
-      </w:r>
-      <w:r>
-        <w:t xml:space="preserve">in our title asserts. Second, we ran a pre-registered replication of the</w:t>
-      </w:r>
-      <w:r>
-        <w:t xml:space="preserve"> </w:t>
-      </w:r>
-      <w:r>
-        <w:t xml:space="preserve">entire protocol on a substantially different domain, 537 expert clinical-decision items, and</w:t>
-      </w:r>
-      <w:r>
-        <w:t xml:space="preserve"> </w:t>
-      </w:r>
-      <w:r>
-        <w:t xml:space="preserve">report it whatever the outcome. Every number below is regenerated by the released code from the</w:t>
-      </w:r>
-      <w:r>
-        <w:t xml:space="preserve"> </w:t>
-      </w:r>
-      <w:r>
-        <w:t xml:space="preserve">frozen data.</w:t>
       </w:r>
     </w:p>
     <w:p>

</xml_diff>